<commit_message>
fix(seed-sc): give M4-L1 real firewall-log evidence and quiet the WAN noise
</commit_message>
<xml_diff>
--- a/docs/SC-Lab-Completion-Guide.docx
+++ b/docs/SC-Lab-Completion-Guide.docx
@@ -8382,6 +8382,102 @@
           <w:b/>
         </w:rPr>
         <w:t xml:space="preserve">Status → System Logs → Firewall</w:t>
+      </w:r>
+    </w:p>
+    <w:p>
+      <w:pPr>
+        <w:numPr>
+          <w:ilvl w:val="0"/>
+          <w:numId w:val="1000"/>
+        </w:numPr>
+        <w:pStyle w:val="BlockText"/>
+      </w:pPr>
+      <w:r>
+        <w:t xml:space="preserve">The log holds several hundred entries. Use the</w:t>
+      </w:r>
+      <w:r>
+        <w:t xml:space="preserve"> </w:t>
+      </w:r>
+      <w:r>
+        <w:rPr>
+          <w:b/>
+        </w:rPr>
+        <w:t xml:space="preserve">Advanced Log Filter</w:t>
+      </w:r>
+      <w:r>
+        <w:t xml:space="preserve"> </w:t>
+      </w:r>
+      <w:r>
+        <w:t xml:space="preserve">(click the filter icon) to search one thing at a time — for example</w:t>
+      </w:r>
+      <w:r>
+        <w:t xml:space="preserve"> </w:t>
+      </w:r>
+      <w:r>
+        <w:rPr>
+          <w:rStyle w:val="VerbatimChar"/>
+        </w:rPr>
+        <w:t xml:space="preserve">22</w:t>
+      </w:r>
+      <w:r>
+        <w:t xml:space="preserve"> </w:t>
+      </w:r>
+      <w:r>
+        <w:t xml:space="preserve">or</w:t>
+      </w:r>
+      <w:r>
+        <w:t xml:space="preserve"> </w:t>
+      </w:r>
+      <w:r>
+        <w:rPr>
+          <w:rStyle w:val="VerbatimChar"/>
+        </w:rPr>
+        <w:t xml:space="preserve">3389</w:t>
+      </w:r>
+      <w:r>
+        <w:t xml:space="preserve"> </w:t>
+      </w:r>
+      <w:r>
+        <w:t xml:space="preserve">in</w:t>
+      </w:r>
+      <w:r>
+        <w:t xml:space="preserve"> </w:t>
+      </w:r>
+      <w:r>
+        <w:rPr>
+          <w:i/>
+        </w:rPr>
+        <w:t xml:space="preserve">Destination Port</w:t>
+      </w:r>
+      <w:r>
+        <w:t xml:space="preserve">, or</w:t>
+      </w:r>
+      <w:r>
+        <w:t xml:space="preserve"> </w:t>
+      </w:r>
+      <w:r>
+        <w:rPr>
+          <w:rStyle w:val="VerbatimChar"/>
+        </w:rPr>
+        <w:t xml:space="preserve">6667</w:t>
+      </w:r>
+      <w:r>
+        <w:t xml:space="preserve"> </w:t>
+      </w:r>
+      <w:r>
+        <w:t xml:space="preserve">to find IRC traffic.</w:t>
+      </w:r>
+      <w:r>
+        <w:t xml:space="preserve"> </w:t>
+      </w:r>
+      <w:r>
+        <w:t xml:space="preserve">Entries on the WAN interface are inbound from outside your pod; entries</w:t>
+      </w:r>
+      <w:r>
+        <w:t xml:space="preserve"> </w:t>
+      </w:r>
+      <w:r>
+        <w:t xml:space="preserve">on the LAN interface come from hosts inside it.</w:t>
       </w:r>
     </w:p>
     <w:p>

</xml_diff>

<commit_message>
fix(seed-sc): keep management access reachable after a student default deny
</commit_message>
<xml_diff>
--- a/docs/SC-Lab-Completion-Guide.docx
+++ b/docs/SC-Lab-Completion-Guide.docx
@@ -5156,7 +5156,40 @@
         <w:pStyle w:val="Compact"/>
       </w:pPr>
       <w:r>
-        <w:t xml:space="preserve">Allow inbound HTTP/HTTPS from WAN to DMZ web server</w:t>
+        <w:t xml:space="preserve">Allow inbound HTTP/HTTPS from WAN to the DMZ web server at</w:t>
+      </w:r>
+      <w:r>
+        <w:t xml:space="preserve"> </w:t>
+      </w:r>
+      <w:r>
+        <w:rPr>
+          <w:rStyle w:val="VerbatimChar"/>
+        </w:rPr>
+        <w:t xml:space="preserve">10.52.XX.50</w:t>
+      </w:r>
+      <w:r>
+        <w:t xml:space="preserve"> </w:t>
+      </w:r>
+      <w:r>
+        <w:t xml:space="preserve">(the web server keeps its host number,</w:t>
+      </w:r>
+      <w:r>
+        <w:t xml:space="preserve"> </w:t>
+      </w:r>
+      <w:r>
+        <w:rPr>
+          <w:rStyle w:val="VerbatimChar"/>
+        </w:rPr>
+        <w:t xml:space="preserve">.50</w:t>
+      </w:r>
+      <w:r>
+        <w:t xml:space="preserve">, and moves from the LAN subnet</w:t>
+      </w:r>
+      <w:r>
+        <w:t xml:space="preserve"> </w:t>
+      </w:r>
+      <w:r>
+        <w:t xml:space="preserve">into the DMZ subnet)</w:t>
       </w:r>
     </w:p>
     <w:p>
@@ -5262,7 +5295,49 @@
         <w:pStyle w:val="Compact"/>
       </w:pPr>
       <w:r>
-        <w:t xml:space="preserve">Change the target from the LAN IP to the new DMZ IP</w:t>
+        <w:t xml:space="preserve">Change the target from the LAN IP</w:t>
+      </w:r>
+      <w:r>
+        <w:t xml:space="preserve"> </w:t>
+      </w:r>
+      <w:r>
+        <w:rPr>
+          <w:rStyle w:val="VerbatimChar"/>
+        </w:rPr>
+        <w:t xml:space="preserve">10.51.XX.50</w:t>
+      </w:r>
+      <w:r>
+        <w:t xml:space="preserve"> </w:t>
+      </w:r>
+      <w:r>
+        <w:t xml:space="preserve">to the DMZ IP</w:t>
+      </w:r>
+      <w:r>
+        <w:t xml:space="preserve"> </w:t>
+      </w:r>
+      <w:r>
+        <w:rPr>
+          <w:rStyle w:val="VerbatimChar"/>
+        </w:rPr>
+        <w:t xml:space="preserve">10.52.XX.50</w:t>
+      </w:r>
+      <w:r>
+        <w:t xml:space="preserve">,</w:t>
+      </w:r>
+      <w:r>
+        <w:t xml:space="preserve"> </w:t>
+      </w:r>
+      <w:r>
+        <w:t xml:space="preserve">redirect target port</w:t>
+      </w:r>
+      <w:r>
+        <w:t xml:space="preserve"> </w:t>
+      </w:r>
+      <w:r>
+        <w:rPr>
+          <w:rStyle w:val="VerbatimChar"/>
+        </w:rPr>
+        <w:t xml:space="preserve">80</w:t>
       </w:r>
     </w:p>
     <w:p>
@@ -10808,6 +10883,30 @@
             </w:pPr>
             <w:r>
               <w:t xml:space="preserve">Don't delete it — it keeps you from locking yourself out of the web UI</w:t>
+            </w:r>
+          </w:p>
+        </w:tc>
+      </w:tr>
+      <w:tr>
+        <w:tc>
+          <w:p>
+            <w:pPr>
+              <w:pStyle w:val="Compact"/>
+              <w:jc w:val="left"/>
+            </w:pPr>
+            <w:r>
+              <w:t xml:space="preserve">Ticking "Disable webConfigurator anti-lockout rule" in System → Advanced</w:t>
+            </w:r>
+          </w:p>
+        </w:tc>
+        <w:tc>
+          <w:p>
+            <w:pPr>
+              <w:pStyle w:val="Compact"/>
+              <w:jc w:val="left"/>
+            </w:pPr>
+            <w:r>
+              <w:t xml:space="preserve">Leave it unticked. With it disabled, your own default deny also blocks management access, and lab validation can no longer reach your gateway</w:t>
             </w:r>
           </w:p>
         </w:tc>

</xml_diff>